<commit_message>
Update test suite documentation to reflect new test cases and clarify offline behavior
</commit_message>
<xml_diff>
--- a/MIXAP_Test_Suite_Documentation_wip.docx
+++ b/MIXAP_Test_Suite_Documentation_wip.docx
@@ -432,44 +432,12 @@
           <w:szCs w:val="19"/>
         </w:rPr>
         <w:t xml:space="preserve">py -m robot 001_open_app.robot            # run a single suite file</w:t>
-      </w:r>
-      <w:r>
-        <w:rPr>
-          <w:rFonts w:ascii="Consolas" w:cs="Consolas" w:eastAsia="Consolas" w:hAnsi="Consolas"/>
-          <w:color w:val="1B1B1B"/>
-          <w:sz w:val="19"/>
-          <w:szCs w:val="19"/>
-        </w:rPr>
         <w:br/>
         <w:t xml:space="preserve">py -m robot 002_create_empty*.robot       # a file + its _offline sibling</w:t>
-      </w:r>
-      <w:r>
-        <w:rPr>
-          <w:rFonts w:ascii="Consolas" w:cs="Consolas" w:eastAsia="Consolas" w:hAnsi="Consolas"/>
-          <w:color w:val="1B1B1B"/>
-          <w:sz w:val="19"/>
-          <w:szCs w:val="19"/>
-        </w:rPr>
         <w:br/>
         <w:t xml:space="preserve">py -m robot .                             # run the entire suite (70+ files)</w:t>
-      </w:r>
-      <w:r>
-        <w:rPr>
-          <w:rFonts w:ascii="Consolas" w:cs="Consolas" w:eastAsia="Consolas" w:hAnsi="Consolas"/>
-          <w:color w:val="1B1B1B"/>
-          <w:sz w:val="19"/>
-          <w:szCs w:val="19"/>
-        </w:rPr>
         <w:br/>
         <w:t xml:space="preserve">py -m robot --outputdir out &lt;file&gt;.robot  # keep artifacts out of the repo root</w:t>
-      </w:r>
-      <w:r>
-        <w:rPr>
-          <w:rFonts w:ascii="Consolas" w:cs="Consolas" w:eastAsia="Consolas" w:hAnsi="Consolas"/>
-          <w:color w:val="1B1B1B"/>
-          <w:sz w:val="19"/>
-          <w:szCs w:val="19"/>
-        </w:rPr>
         <w:br/>
         <w:t xml:space="preserve">py -m robot --dryrun &lt;file&gt;.robot         # syntax/keyword check, no browser</w:t>
       </w:r>
@@ -939,74 +907,18 @@
           <w:szCs w:val="19"/>
         </w:rPr>
         <w:t xml:space="preserve">*** Test Cases ***</w:t>
-      </w:r>
-      <w:r>
-        <w:rPr>
-          <w:rFonts w:ascii="Consolas" w:cs="Consolas" w:eastAsia="Consolas" w:hAnsi="Consolas"/>
-          <w:color w:val="1B1B1B"/>
-          <w:sz w:val="19"/>
-          <w:szCs w:val="19"/>
-        </w:rPr>
         <w:br/>
         <w:t xml:space="preserve">Sign up</w:t>
-      </w:r>
-      <w:r>
-        <w:rPr>
-          <w:rFonts w:ascii="Consolas" w:cs="Consolas" w:eastAsia="Consolas" w:hAnsi="Consolas"/>
-          <w:color w:val="1B1B1B"/>
-          <w:sz w:val="19"/>
-          <w:szCs w:val="19"/>
-        </w:rPr>
         <w:br/>
         <w:t xml:space="preserve">    Open Web Application</w:t>
-      </w:r>
-      <w:r>
-        <w:rPr>
-          <w:rFonts w:ascii="Consolas" w:cs="Consolas" w:eastAsia="Consolas" w:hAnsi="Consolas"/>
-          <w:color w:val="1B1B1B"/>
-          <w:sz w:val="19"/>
-          <w:szCs w:val="19"/>
-        </w:rPr>
         <w:br/>
         <w:t xml:space="preserve">    Maximize Browser Window</w:t>
-      </w:r>
-      <w:r>
-        <w:rPr>
-          <w:rFonts w:ascii="Consolas" w:cs="Consolas" w:eastAsia="Consolas" w:hAnsi="Consolas"/>
-          <w:color w:val="1B1B1B"/>
-          <w:sz w:val="19"/>
-          <w:szCs w:val="19"/>
-        </w:rPr>
         <w:br/>
         <w:t xml:space="preserve">    Sign Up    testuser3    test3@example.com    password123</w:t>
-      </w:r>
-      <w:r>
-        <w:rPr>
-          <w:rFonts w:ascii="Consolas" w:cs="Consolas" w:eastAsia="Consolas" w:hAnsi="Consolas"/>
-          <w:color w:val="1B1B1B"/>
-          <w:sz w:val="19"/>
-          <w:szCs w:val="19"/>
-        </w:rPr>
         <w:br/>
         <w:t xml:space="preserve">    Wait Until Element Is Visible</w:t>
-      </w:r>
-      <w:r>
-        <w:rPr>
-          <w:rFonts w:ascii="Consolas" w:cs="Consolas" w:eastAsia="Consolas" w:hAnsi="Consolas"/>
-          <w:color w:val="1B1B1B"/>
-          <w:sz w:val="19"/>
-          <w:szCs w:val="19"/>
-        </w:rPr>
         <w:br/>
         <w:t xml:space="preserve">    ...    xpath=//button[.//span[text()='testuser3']]    15s</w:t>
-      </w:r>
-      <w:r>
-        <w:rPr>
-          <w:rFonts w:ascii="Consolas" w:cs="Consolas" w:eastAsia="Consolas" w:hAnsi="Consolas"/>
-          <w:color w:val="1B1B1B"/>
-          <w:sz w:val="19"/>
-          <w:szCs w:val="19"/>
-        </w:rPr>
         <w:br/>
         <w:t xml:space="preserve">    Close Browser</w:t>
       </w:r>
@@ -1546,34 +1458,10 @@
           <w:szCs w:val="19"/>
         </w:rPr>
         <w:t xml:space="preserve">*** Settings ***</w:t>
-      </w:r>
-      <w:r>
-        <w:rPr>
-          <w:rFonts w:ascii="Consolas" w:cs="Consolas" w:eastAsia="Consolas" w:hAnsi="Consolas"/>
-          <w:color w:val="1B1B1B"/>
-          <w:sz w:val="19"/>
-          <w:szCs w:val="19"/>
-        </w:rPr>
         <w:br/>
         <w:t xml:space="preserve">Library    SeleniumLibrary</w:t>
-      </w:r>
-      <w:r>
-        <w:rPr>
-          <w:rFonts w:ascii="Consolas" w:cs="Consolas" w:eastAsia="Consolas" w:hAnsi="Consolas"/>
-          <w:color w:val="1B1B1B"/>
-          <w:sz w:val="19"/>
-          <w:szCs w:val="19"/>
-        </w:rPr>
         <w:br/>
         <w:t xml:space="preserve">Library    OperatingSystem</w:t>
-      </w:r>
-      <w:r>
-        <w:rPr>
-          <w:rFonts w:ascii="Consolas" w:cs="Consolas" w:eastAsia="Consolas" w:hAnsi="Consolas"/>
-          <w:color w:val="1B1B1B"/>
-          <w:sz w:val="19"/>
-          <w:szCs w:val="19"/>
-        </w:rPr>
         <w:br/>
         <w:t xml:space="preserve">Resource       ./ressources.robot</w:t>
       </w:r>
@@ -1632,64 +1520,16 @@
           <w:szCs w:val="19"/>
         </w:rPr>
         <w:t xml:space="preserve">*** Test Cases ***</w:t>
-      </w:r>
-      <w:r>
-        <w:rPr>
-          <w:rFonts w:ascii="Consolas" w:cs="Consolas" w:eastAsia="Consolas" w:hAnsi="Consolas"/>
-          <w:color w:val="1B1B1B"/>
-          <w:sz w:val="19"/>
-          <w:szCs w:val="19"/>
-        </w:rPr>
         <w:br/>
         <w:t xml:space="preserve">Create empty augmented activity</w:t>
-      </w:r>
-      <w:r>
-        <w:rPr>
-          <w:rFonts w:ascii="Consolas" w:cs="Consolas" w:eastAsia="Consolas" w:hAnsi="Consolas"/>
-          <w:color w:val="1B1B1B"/>
-          <w:sz w:val="19"/>
-          <w:szCs w:val="19"/>
-        </w:rPr>
         <w:br/>
         <w:t xml:space="preserve">    Open Web Application</w:t>
-      </w:r>
-      <w:r>
-        <w:rPr>
-          <w:rFonts w:ascii="Consolas" w:cs="Consolas" w:eastAsia="Consolas" w:hAnsi="Consolas"/>
-          <w:color w:val="1B1B1B"/>
-          <w:sz w:val="19"/>
-          <w:szCs w:val="19"/>
-        </w:rPr>
         <w:br/>
         <w:t xml:space="preserve">    Create Activity</w:t>
-      </w:r>
-      <w:r>
-        <w:rPr>
-          <w:rFonts w:ascii="Consolas" w:cs="Consolas" w:eastAsia="Consolas" w:hAnsi="Consolas"/>
-          <w:color w:val="1B1B1B"/>
-          <w:sz w:val="19"/>
-          <w:szCs w:val="19"/>
-        </w:rPr>
         <w:br/>
         <w:t xml:space="preserve"/>
-      </w:r>
-      <w:r>
-        <w:rPr>
-          <w:rFonts w:ascii="Consolas" w:cs="Consolas" w:eastAsia="Consolas" w:hAnsi="Consolas"/>
-          <w:color w:val="1B1B1B"/>
-          <w:sz w:val="19"/>
-          <w:szCs w:val="19"/>
-        </w:rPr>
         <w:br/>
         <w:t xml:space="preserve">Select Type</w:t>
-      </w:r>
-      <w:r>
-        <w:rPr>
-          <w:rFonts w:ascii="Consolas" w:cs="Consolas" w:eastAsia="Consolas" w:hAnsi="Consolas"/>
-          <w:color w:val="1B1B1B"/>
-          <w:sz w:val="19"/>
-          <w:szCs w:val="19"/>
-        </w:rPr>
         <w:br/>
         <w:t xml:space="preserve">    Select Activity Type    Augmented activity</w:t>
       </w:r>
@@ -1832,64 +1672,16 @@
           <w:szCs w:val="19"/>
         </w:rPr>
         <w:t xml:space="preserve">Wait For Activity</w:t>
-      </w:r>
-      <w:r>
-        <w:rPr>
-          <w:rFonts w:ascii="Consolas" w:cs="Consolas" w:eastAsia="Consolas" w:hAnsi="Consolas"/>
-          <w:color w:val="1B1B1B"/>
-          <w:sz w:val="19"/>
-          <w:szCs w:val="19"/>
-        </w:rPr>
         <w:br/>
         <w:t xml:space="preserve">    [Documentation]    Wait until the activity/path card identified by the</w:t>
-      </w:r>
-      <w:r>
-        <w:rPr>
-          <w:rFonts w:ascii="Consolas" w:cs="Consolas" w:eastAsia="Consolas" w:hAnsi="Consolas"/>
-          <w:color w:val="1B1B1B"/>
-          <w:sz w:val="19"/>
-          <w:szCs w:val="19"/>
-        </w:rPr>
         <w:br/>
         <w:t xml:space="preserve">    ...    provided title is visible on the home menu.</w:t>
-      </w:r>
-      <w:r>
-        <w:rPr>
-          <w:rFonts w:ascii="Consolas" w:cs="Consolas" w:eastAsia="Consolas" w:hAnsi="Consolas"/>
-          <w:color w:val="1B1B1B"/>
-          <w:sz w:val="19"/>
-          <w:szCs w:val="19"/>
-        </w:rPr>
         <w:br/>
         <w:t xml:space="preserve">    [Arguments]    ${activity_title}    ${timeout}=15s</w:t>
-      </w:r>
-      <w:r>
-        <w:rPr>
-          <w:rFonts w:ascii="Consolas" w:cs="Consolas" w:eastAsia="Consolas" w:hAnsi="Consolas"/>
-          <w:color w:val="1B1B1B"/>
-          <w:sz w:val="19"/>
-          <w:szCs w:val="19"/>
-        </w:rPr>
         <w:br/>
         <w:t xml:space="preserve">    Wait Until Element Is Visible</w:t>
-      </w:r>
-      <w:r>
-        <w:rPr>
-          <w:rFonts w:ascii="Consolas" w:cs="Consolas" w:eastAsia="Consolas" w:hAnsi="Consolas"/>
-          <w:color w:val="1B1B1B"/>
-          <w:sz w:val="19"/>
-          <w:szCs w:val="19"/>
-        </w:rPr>
         <w:br/>
         <w:t xml:space="preserve">    ...    xpath=//div[h3[contains(@class, 'activity-card') and text()='${activity_title}']]</w:t>
-      </w:r>
-      <w:r>
-        <w:rPr>
-          <w:rFonts w:ascii="Consolas" w:cs="Consolas" w:eastAsia="Consolas" w:hAnsi="Consolas"/>
-          <w:color w:val="1B1B1B"/>
-          <w:sz w:val="19"/>
-          <w:szCs w:val="19"/>
-        </w:rPr>
         <w:br/>
         <w:t xml:space="preserve">    ...    ${timeout}</w:t>
       </w:r>
@@ -2388,84 +2180,20 @@
           <w:szCs w:val="19"/>
         </w:rPr>
         <w:t xml:space="preserve">IF    '${activity_title}' != '${EMPTY}'</w:t>
-      </w:r>
-      <w:r>
-        <w:rPr>
-          <w:rFonts w:ascii="Consolas" w:cs="Consolas" w:eastAsia="Consolas" w:hAnsi="Consolas"/>
-          <w:color w:val="1B1B1B"/>
-          <w:sz w:val="19"/>
-          <w:szCs w:val="19"/>
-        </w:rPr>
         <w:br/>
         <w:t xml:space="preserve">    Wait For Activity    ${activity_title}</w:t>
-      </w:r>
-      <w:r>
-        <w:rPr>
-          <w:rFonts w:ascii="Consolas" w:cs="Consolas" w:eastAsia="Consolas" w:hAnsi="Consolas"/>
-          <w:color w:val="1B1B1B"/>
-          <w:sz w:val="19"/>
-          <w:szCs w:val="19"/>
-        </w:rPr>
         <w:br/>
         <w:t xml:space="preserve">ELSE</w:t>
-      </w:r>
-      <w:r>
-        <w:rPr>
-          <w:rFonts w:ascii="Consolas" w:cs="Consolas" w:eastAsia="Consolas" w:hAnsi="Consolas"/>
-          <w:color w:val="1B1B1B"/>
-          <w:sz w:val="19"/>
-          <w:szCs w:val="19"/>
-        </w:rPr>
         <w:br/>
         <w:t xml:space="preserve">    Log    No specific title given</w:t>
-      </w:r>
-      <w:r>
-        <w:rPr>
-          <w:rFonts w:ascii="Consolas" w:cs="Consolas" w:eastAsia="Consolas" w:hAnsi="Consolas"/>
-          <w:color w:val="1B1B1B"/>
-          <w:sz w:val="19"/>
-          <w:szCs w:val="19"/>
-        </w:rPr>
         <w:br/>
         <w:t xml:space="preserve">END</w:t>
-      </w:r>
-      <w:r>
-        <w:rPr>
-          <w:rFonts w:ascii="Consolas" w:cs="Consolas" w:eastAsia="Consolas" w:hAnsi="Consolas"/>
-          <w:color w:val="1B1B1B"/>
-          <w:sz w:val="19"/>
-          <w:szCs w:val="19"/>
-        </w:rPr>
         <w:br/>
         <w:t xml:space="preserve"/>
-      </w:r>
-      <w:r>
-        <w:rPr>
-          <w:rFonts w:ascii="Consolas" w:cs="Consolas" w:eastAsia="Consolas" w:hAnsi="Consolas"/>
-          <w:color w:val="1B1B1B"/>
-          <w:sz w:val="19"/>
-          <w:szCs w:val="19"/>
-        </w:rPr>
         <w:br/>
         <w:t xml:space="preserve">FOR    ${i}    IN RANGE    1    8</w:t>
-      </w:r>
-      <w:r>
-        <w:rPr>
-          <w:rFonts w:ascii="Consolas" w:cs="Consolas" w:eastAsia="Consolas" w:hAnsi="Consolas"/>
-          <w:color w:val="1B1B1B"/>
-          <w:sz w:val="19"/>
-          <w:szCs w:val="19"/>
-        </w:rPr>
         <w:br/>
         <w:t xml:space="preserve">    Duplicate Activity    ${current_title}</w:t>
-      </w:r>
-      <w:r>
-        <w:rPr>
-          <w:rFonts w:ascii="Consolas" w:cs="Consolas" w:eastAsia="Consolas" w:hAnsi="Consolas"/>
-          <w:color w:val="1B1B1B"/>
-          <w:sz w:val="19"/>
-          <w:szCs w:val="19"/>
-        </w:rPr>
         <w:br/>
         <w:t xml:space="preserve">END</w:t>
       </w:r>
@@ -3251,7 +2979,7 @@
           <w:sz w:val="22"/>
           <w:szCs w:val="22"/>
         </w:rPr>
-        <w:t xml:space="preserve">Test files are numbered NNN_description.robot (currently 001–053), and most have an NNN_description_offline.robot sibling that repeats the same scenario after calling Go Offline. Several later files (049–053) also carry “- Slow 3G” duplicate test cases inside the same file rather than a separate sibling file (see Section 4.6).</w:t>
+        <w:t xml:space="preserve">Test files are numbered NNN_description.robot (currently 001–058), and most have an NNN_description_offline.robot sibling that repeats the same scenario after calling Go Offline. Several later files (049–053) also carry “- Slow 3G” duplicate test cases inside the same file rather than a separate sibling file (see Section 4.6).</w:t>
       </w:r>
     </w:p>
     <w:p>
@@ -3480,54 +3208,14 @@
           <w:szCs w:val="19"/>
         </w:rPr>
         <w:t xml:space="preserve">&lt;div class="activity-card activity-card--&lt;type&gt; ..." data-id="..."&gt;</w:t>
-      </w:r>
-      <w:r>
-        <w:rPr>
-          <w:rFonts w:ascii="Consolas" w:cs="Consolas" w:eastAsia="Consolas" w:hAnsi="Consolas"/>
-          <w:color w:val="1B1B1B"/>
-          <w:sz w:val="19"/>
-          <w:szCs w:val="19"/>
-        </w:rPr>
         <w:br/>
         <w:t xml:space="preserve">  &lt;- the real card, owns data-id and the action buttons</w:t>
-      </w:r>
-      <w:r>
-        <w:rPr>
-          <w:rFonts w:ascii="Consolas" w:cs="Consolas" w:eastAsia="Consolas" w:hAnsi="Consolas"/>
-          <w:color w:val="1B1B1B"/>
-          <w:sz w:val="19"/>
-          <w:szCs w:val="19"/>
-        </w:rPr>
         <w:br/>
         <w:t xml:space="preserve">  &lt;div class="activity-card__content"&gt;</w:t>
-      </w:r>
-      <w:r>
-        <w:rPr>
-          <w:rFonts w:ascii="Consolas" w:cs="Consolas" w:eastAsia="Consolas" w:hAnsi="Consolas"/>
-          <w:color w:val="1B1B1B"/>
-          <w:sz w:val="19"/>
-          <w:szCs w:val="19"/>
-        </w:rPr>
         <w:br/>
         <w:t xml:space="preserve">    &lt;div class="activity-card__title-wrapper"&gt;</w:t>
-      </w:r>
-      <w:r>
-        <w:rPr>
-          <w:rFonts w:ascii="Consolas" w:cs="Consolas" w:eastAsia="Consolas" w:hAnsi="Consolas"/>
-          <w:color w:val="1B1B1B"/>
-          <w:sz w:val="19"/>
-          <w:szCs w:val="19"/>
-        </w:rPr>
         <w:br/>
         <w:t xml:space="preserve">      &lt;h3 class="activity-card__title ..."&gt;{title}&lt;/h3&gt;</w:t>
-      </w:r>
-      <w:r>
-        <w:rPr>
-          <w:rFonts w:ascii="Consolas" w:cs="Consolas" w:eastAsia="Consolas" w:hAnsi="Consolas"/>
-          <w:color w:val="1B1B1B"/>
-          <w:sz w:val="19"/>
-          <w:szCs w:val="19"/>
-        </w:rPr>
         <w:br/>
         <w:t xml:space="preserve">      &lt;- what most xpaths match on</w:t>
       </w:r>
@@ -3882,114 +3570,26 @@
           <w:szCs w:val="19"/>
         </w:rPr>
         <w:t xml:space="preserve">Sign up</w:t>
-      </w:r>
-      <w:r>
-        <w:rPr>
-          <w:rFonts w:ascii="Consolas" w:cs="Consolas" w:eastAsia="Consolas" w:hAnsi="Consolas"/>
-          <w:color w:val="1B1B1B"/>
-          <w:sz w:val="19"/>
-          <w:szCs w:val="19"/>
-        </w:rPr>
         <w:br/>
         <w:t xml:space="preserve">    Open Web Application</w:t>
-      </w:r>
-      <w:r>
-        <w:rPr>
-          <w:rFonts w:ascii="Consolas" w:cs="Consolas" w:eastAsia="Consolas" w:hAnsi="Consolas"/>
-          <w:color w:val="1B1B1B"/>
-          <w:sz w:val="19"/>
-          <w:szCs w:val="19"/>
-        </w:rPr>
         <w:br/>
         <w:t xml:space="preserve">    Maximize Browser Window</w:t>
-      </w:r>
-      <w:r>
-        <w:rPr>
-          <w:rFonts w:ascii="Consolas" w:cs="Consolas" w:eastAsia="Consolas" w:hAnsi="Consolas"/>
-          <w:color w:val="1B1B1B"/>
-          <w:sz w:val="19"/>
-          <w:szCs w:val="19"/>
-        </w:rPr>
         <w:br/>
         <w:t xml:space="preserve">    Sign Up    testuser3    test3@example.com    password123</w:t>
-      </w:r>
-      <w:r>
-        <w:rPr>
-          <w:rFonts w:ascii="Consolas" w:cs="Consolas" w:eastAsia="Consolas" w:hAnsi="Consolas"/>
-          <w:color w:val="1B1B1B"/>
-          <w:sz w:val="19"/>
-          <w:szCs w:val="19"/>
-        </w:rPr>
         <w:br/>
         <w:t xml:space="preserve">    ...</w:t>
-      </w:r>
-      <w:r>
-        <w:rPr>
-          <w:rFonts w:ascii="Consolas" w:cs="Consolas" w:eastAsia="Consolas" w:hAnsi="Consolas"/>
-          <w:color w:val="1B1B1B"/>
-          <w:sz w:val="19"/>
-          <w:szCs w:val="19"/>
-        </w:rPr>
         <w:br/>
         <w:t xml:space="preserve"/>
-      </w:r>
-      <w:r>
-        <w:rPr>
-          <w:rFonts w:ascii="Consolas" w:cs="Consolas" w:eastAsia="Consolas" w:hAnsi="Consolas"/>
-          <w:color w:val="1B1B1B"/>
-          <w:sz w:val="19"/>
-          <w:szCs w:val="19"/>
-        </w:rPr>
         <w:br/>
         <w:t xml:space="preserve">Sign up - Slow 3G</w:t>
-      </w:r>
-      <w:r>
-        <w:rPr>
-          <w:rFonts w:ascii="Consolas" w:cs="Consolas" w:eastAsia="Consolas" w:hAnsi="Consolas"/>
-          <w:color w:val="1B1B1B"/>
-          <w:sz w:val="19"/>
-          <w:szCs w:val="19"/>
-        </w:rPr>
         <w:br/>
         <w:t xml:space="preserve">    Open Web Application</w:t>
-      </w:r>
-      <w:r>
-        <w:rPr>
-          <w:rFonts w:ascii="Consolas" w:cs="Consolas" w:eastAsia="Consolas" w:hAnsi="Consolas"/>
-          <w:color w:val="1B1B1B"/>
-          <w:sz w:val="19"/>
-          <w:szCs w:val="19"/>
-        </w:rPr>
         <w:br/>
         <w:t xml:space="preserve">    Set Network Speed</w:t>
-      </w:r>
-      <w:r>
-        <w:rPr>
-          <w:rFonts w:ascii="Consolas" w:cs="Consolas" w:eastAsia="Consolas" w:hAnsi="Consolas"/>
-          <w:color w:val="1B1B1B"/>
-          <w:sz w:val="19"/>
-          <w:szCs w:val="19"/>
-        </w:rPr>
         <w:br/>
         <w:t xml:space="preserve">    Maximize Browser Window</w:t>
-      </w:r>
-      <w:r>
-        <w:rPr>
-          <w:rFonts w:ascii="Consolas" w:cs="Consolas" w:eastAsia="Consolas" w:hAnsi="Consolas"/>
-          <w:color w:val="1B1B1B"/>
-          <w:sz w:val="19"/>
-          <w:szCs w:val="19"/>
-        </w:rPr>
         <w:br/>
         <w:t xml:space="preserve">    Sign Up    testuser3    test3@example.com    password123</w:t>
-      </w:r>
-      <w:r>
-        <w:rPr>
-          <w:rFonts w:ascii="Consolas" w:cs="Consolas" w:eastAsia="Consolas" w:hAnsi="Consolas"/>
-          <w:color w:val="1B1B1B"/>
-          <w:sz w:val="19"/>
-          <w:szCs w:val="19"/>
-        </w:rPr>
         <w:br/>
         <w:t xml:space="preserve">    ...</w:t>
       </w:r>
@@ -4371,194 +3971,42 @@
           <w:szCs w:val="19"/>
         </w:rPr>
         <w:t xml:space="preserve">Set Sort Order</w:t>
-      </w:r>
-      <w:r>
-        <w:rPr>
-          <w:rFonts w:ascii="Consolas" w:cs="Consolas" w:eastAsia="Consolas" w:hAnsi="Consolas"/>
-          <w:color w:val="1B1B1B"/>
-          <w:sz w:val="19"/>
-          <w:szCs w:val="19"/>
-        </w:rPr>
         <w:br/>
         <w:t xml:space="preserve">    [Arguments]    ${order}</w:t>
-      </w:r>
-      <w:r>
-        <w:rPr>
-          <w:rFonts w:ascii="Consolas" w:cs="Consolas" w:eastAsia="Consolas" w:hAnsi="Consolas"/>
-          <w:color w:val="1B1B1B"/>
-          <w:sz w:val="19"/>
-          <w:szCs w:val="19"/>
-        </w:rPr>
         <w:br/>
         <w:t xml:space="preserve">    Wait Until Element Is Visible</w:t>
-      </w:r>
-      <w:r>
-        <w:rPr>
-          <w:rFonts w:ascii="Consolas" w:cs="Consolas" w:eastAsia="Consolas" w:hAnsi="Consolas"/>
-          <w:color w:val="1B1B1B"/>
-          <w:sz w:val="19"/>
-          <w:szCs w:val="19"/>
-        </w:rPr>
         <w:br/>
         <w:t xml:space="preserve">    ...    xpath=//button[contains(@class, 'home__filter-btn--sort')]    5s</w:t>
-      </w:r>
-      <w:r>
-        <w:rPr>
-          <w:rFonts w:ascii="Consolas" w:cs="Consolas" w:eastAsia="Consolas" w:hAnsi="Consolas"/>
-          <w:color w:val="1B1B1B"/>
-          <w:sz w:val="19"/>
-          <w:szCs w:val="19"/>
-        </w:rPr>
         <w:br/>
         <w:t xml:space="preserve">    Click Element    xpath=//button[contains(@class, 'home__filter-btn--sort')]</w:t>
-      </w:r>
-      <w:r>
-        <w:rPr>
-          <w:rFonts w:ascii="Consolas" w:cs="Consolas" w:eastAsia="Consolas" w:hAnsi="Consolas"/>
-          <w:color w:val="1B1B1B"/>
-          <w:sz w:val="19"/>
-          <w:szCs w:val="19"/>
-        </w:rPr>
         <w:br/>
         <w:t xml:space="preserve">    Wait Until Element Is Visible</w:t>
-      </w:r>
-      <w:r>
-        <w:rPr>
-          <w:rFonts w:ascii="Consolas" w:cs="Consolas" w:eastAsia="Consolas" w:hAnsi="Consolas"/>
-          <w:color w:val="1B1B1B"/>
-          <w:sz w:val="19"/>
-          <w:szCs w:val="19"/>
-        </w:rPr>
         <w:br/>
         <w:t xml:space="preserve">    ...    xpath=//div[contains(@class, 'home__sort-content')]    5s</w:t>
-      </w:r>
-      <w:r>
-        <w:rPr>
-          <w:rFonts w:ascii="Consolas" w:cs="Consolas" w:eastAsia="Consolas" w:hAnsi="Consolas"/>
-          <w:color w:val="1B1B1B"/>
-          <w:sz w:val="19"/>
-          <w:szCs w:val="19"/>
-        </w:rPr>
         <w:br/>
         <w:t xml:space="preserve">    IF    "${order}" == "az"</w:t>
-      </w:r>
-      <w:r>
-        <w:rPr>
-          <w:rFonts w:ascii="Consolas" w:cs="Consolas" w:eastAsia="Consolas" w:hAnsi="Consolas"/>
-          <w:color w:val="1B1B1B"/>
-          <w:sz w:val="19"/>
-          <w:szCs w:val="19"/>
-        </w:rPr>
         <w:br/>
         <w:t xml:space="preserve">        Click Element</w:t>
-      </w:r>
-      <w:r>
-        <w:rPr>
-          <w:rFonts w:ascii="Consolas" w:cs="Consolas" w:eastAsia="Consolas" w:hAnsi="Consolas"/>
-          <w:color w:val="1B1B1B"/>
-          <w:sz w:val="19"/>
-          <w:szCs w:val="19"/>
-        </w:rPr>
         <w:br/>
         <w:t xml:space="preserve">        ...    xpath=//div[contains(@class,'home__sort-content')]</w:t>
-      </w:r>
-      <w:r>
-        <w:rPr>
-          <w:rFonts w:ascii="Consolas" w:cs="Consolas" w:eastAsia="Consolas" w:hAnsi="Consolas"/>
-          <w:color w:val="1B1B1B"/>
-          <w:sz w:val="19"/>
-          <w:szCs w:val="19"/>
-        </w:rPr>
         <w:br/>
         <w:t xml:space="preserve">        ...      //label[.//span[text()='Sort A-Z']]</w:t>
-      </w:r>
-      <w:r>
-        <w:rPr>
-          <w:rFonts w:ascii="Consolas" w:cs="Consolas" w:eastAsia="Consolas" w:hAnsi="Consolas"/>
-          <w:color w:val="1B1B1B"/>
-          <w:sz w:val="19"/>
-          <w:szCs w:val="19"/>
-        </w:rPr>
         <w:br/>
         <w:t xml:space="preserve">    ELSE</w:t>
-      </w:r>
-      <w:r>
-        <w:rPr>
-          <w:rFonts w:ascii="Consolas" w:cs="Consolas" w:eastAsia="Consolas" w:hAnsi="Consolas"/>
-          <w:color w:val="1B1B1B"/>
-          <w:sz w:val="19"/>
-          <w:szCs w:val="19"/>
-        </w:rPr>
         <w:br/>
         <w:t xml:space="preserve">        Click Element</w:t>
-      </w:r>
-      <w:r>
-        <w:rPr>
-          <w:rFonts w:ascii="Consolas" w:cs="Consolas" w:eastAsia="Consolas" w:hAnsi="Consolas"/>
-          <w:color w:val="1B1B1B"/>
-          <w:sz w:val="19"/>
-          <w:szCs w:val="19"/>
-        </w:rPr>
         <w:br/>
         <w:t xml:space="preserve">        ...    xpath=//div[contains(@class,'home__sort-content')]</w:t>
-      </w:r>
-      <w:r>
-        <w:rPr>
-          <w:rFonts w:ascii="Consolas" w:cs="Consolas" w:eastAsia="Consolas" w:hAnsi="Consolas"/>
-          <w:color w:val="1B1B1B"/>
-          <w:sz w:val="19"/>
-          <w:szCs w:val="19"/>
-        </w:rPr>
         <w:br/>
         <w:t xml:space="preserve">        ...      //label[.//span[text()='Sort Z-A']]</w:t>
-      </w:r>
-      <w:r>
-        <w:rPr>
-          <w:rFonts w:ascii="Consolas" w:cs="Consolas" w:eastAsia="Consolas" w:hAnsi="Consolas"/>
-          <w:color w:val="1B1B1B"/>
-          <w:sz w:val="19"/>
-          <w:szCs w:val="19"/>
-        </w:rPr>
         <w:br/>
         <w:t xml:space="preserve">    END</w:t>
-      </w:r>
-      <w:r>
-        <w:rPr>
-          <w:rFonts w:ascii="Consolas" w:cs="Consolas" w:eastAsia="Consolas" w:hAnsi="Consolas"/>
-          <w:color w:val="1B1B1B"/>
-          <w:sz w:val="19"/>
-          <w:szCs w:val="19"/>
-        </w:rPr>
         <w:br/>
         <w:t xml:space="preserve">    Click Element    xpath=//div[contains(@class, 'ds-header__logo')]</w:t>
-      </w:r>
-      <w:r>
-        <w:rPr>
-          <w:rFonts w:ascii="Consolas" w:cs="Consolas" w:eastAsia="Consolas" w:hAnsi="Consolas"/>
-          <w:color w:val="1B1B1B"/>
-          <w:sz w:val="19"/>
-          <w:szCs w:val="19"/>
-        </w:rPr>
         <w:br/>
         <w:t xml:space="preserve">    ...    # closes the popover</w:t>
-      </w:r>
-      <w:r>
-        <w:rPr>
-          <w:rFonts w:ascii="Consolas" w:cs="Consolas" w:eastAsia="Consolas" w:hAnsi="Consolas"/>
-          <w:color w:val="1B1B1B"/>
-          <w:sz w:val="19"/>
-          <w:szCs w:val="19"/>
-        </w:rPr>
         <w:br/>
         <w:t xml:space="preserve">    Wait Until Element Is Not Visible</w:t>
-      </w:r>
-      <w:r>
-        <w:rPr>
-          <w:rFonts w:ascii="Consolas" w:cs="Consolas" w:eastAsia="Consolas" w:hAnsi="Consolas"/>
-          <w:color w:val="1B1B1B"/>
-          <w:sz w:val="19"/>
-          <w:szCs w:val="19"/>
-        </w:rPr>
         <w:br/>
         <w:t xml:space="preserve">    ...    xpath=//div[contains(@class, 'home__sort-content')]    5s</w:t>
       </w:r>
@@ -4595,74 +4043,18 @@
           <w:szCs w:val="19"/>
         </w:rPr>
         <w:t xml:space="preserve">Activity Should Appear Before</w:t>
-      </w:r>
-      <w:r>
-        <w:rPr>
-          <w:rFonts w:ascii="Consolas" w:cs="Consolas" w:eastAsia="Consolas" w:hAnsi="Consolas"/>
-          <w:color w:val="1B1B1B"/>
-          <w:sz w:val="19"/>
-          <w:szCs w:val="19"/>
-        </w:rPr>
         <w:br/>
         <w:t xml:space="preserve">    [Arguments]    ${first_title}    ${second_title}</w:t>
-      </w:r>
-      <w:r>
-        <w:rPr>
-          <w:rFonts w:ascii="Consolas" w:cs="Consolas" w:eastAsia="Consolas" w:hAnsi="Consolas"/>
-          <w:color w:val="1B1B1B"/>
-          <w:sz w:val="19"/>
-          <w:szCs w:val="19"/>
-        </w:rPr>
         <w:br/>
         <w:t xml:space="preserve">    ${is_before}=    Execute Javascript</w:t>
-      </w:r>
-      <w:r>
-        <w:rPr>
-          <w:rFonts w:ascii="Consolas" w:cs="Consolas" w:eastAsia="Consolas" w:hAnsi="Consolas"/>
-          <w:color w:val="1B1B1B"/>
-          <w:sz w:val="19"/>
-          <w:szCs w:val="19"/>
-        </w:rPr>
         <w:br/>
         <w:t xml:space="preserve">    ...    var titles=[...document.querySelectorAll("h3.activity-card__title")]</w:t>
-      </w:r>
-      <w:r>
-        <w:rPr>
-          <w:rFonts w:ascii="Consolas" w:cs="Consolas" w:eastAsia="Consolas" w:hAnsi="Consolas"/>
-          <w:color w:val="1B1B1B"/>
-          <w:sz w:val="19"/>
-          <w:szCs w:val="19"/>
-        </w:rPr>
         <w:br/>
         <w:t xml:space="preserve">    ...      .map(function(el){return el.textContent.trim();});</w:t>
-      </w:r>
-      <w:r>
-        <w:rPr>
-          <w:rFonts w:ascii="Consolas" w:cs="Consolas" w:eastAsia="Consolas" w:hAnsi="Consolas"/>
-          <w:color w:val="1B1B1B"/>
-          <w:sz w:val="19"/>
-          <w:szCs w:val="19"/>
-        </w:rPr>
         <w:br/>
         <w:t xml:space="preserve">    ...    return titles.indexOf("${first_title}")</w:t>
-      </w:r>
-      <w:r>
-        <w:rPr>
-          <w:rFonts w:ascii="Consolas" w:cs="Consolas" w:eastAsia="Consolas" w:hAnsi="Consolas"/>
-          <w:color w:val="1B1B1B"/>
-          <w:sz w:val="19"/>
-          <w:szCs w:val="19"/>
-        </w:rPr>
         <w:br/>
         <w:t xml:space="preserve">    ...      &lt; titles.indexOf("${second_title}");</w:t>
-      </w:r>
-      <w:r>
-        <w:rPr>
-          <w:rFonts w:ascii="Consolas" w:cs="Consolas" w:eastAsia="Consolas" w:hAnsi="Consolas"/>
-          <w:color w:val="1B1B1B"/>
-          <w:sz w:val="19"/>
-          <w:szCs w:val="19"/>
-        </w:rPr>
         <w:br/>
         <w:t xml:space="preserve">    Should Be True    ${is_before}</w:t>
       </w:r>
@@ -4708,194 +4100,42 @@
           <w:szCs w:val="19"/>
         </w:rPr>
         <w:t xml:space="preserve">*** Test Cases ***</w:t>
-      </w:r>
-      <w:r>
-        <w:rPr>
-          <w:rFonts w:ascii="Consolas" w:cs="Consolas" w:eastAsia="Consolas" w:hAnsi="Consolas"/>
-          <w:color w:val="1B1B1B"/>
-          <w:sz w:val="19"/>
-          <w:szCs w:val="19"/>
-        </w:rPr>
         <w:br/>
         <w:t xml:space="preserve">Create two differently named activities</w:t>
-      </w:r>
-      <w:r>
-        <w:rPr>
-          <w:rFonts w:ascii="Consolas" w:cs="Consolas" w:eastAsia="Consolas" w:hAnsi="Consolas"/>
-          <w:color w:val="1B1B1B"/>
-          <w:sz w:val="19"/>
-          <w:szCs w:val="19"/>
-        </w:rPr>
         <w:br/>
         <w:t xml:space="preserve">    Open Web Application without closing</w:t>
-      </w:r>
-      <w:r>
-        <w:rPr>
-          <w:rFonts w:ascii="Consolas" w:cs="Consolas" w:eastAsia="Consolas" w:hAnsi="Consolas"/>
-          <w:color w:val="1B1B1B"/>
-          <w:sz w:val="19"/>
-          <w:szCs w:val="19"/>
-        </w:rPr>
         <w:br/>
         <w:t xml:space="preserve">    Maximize Browser Window</w:t>
-      </w:r>
-      <w:r>
-        <w:rPr>
-          <w:rFonts w:ascii="Consolas" w:cs="Consolas" w:eastAsia="Consolas" w:hAnsi="Consolas"/>
-          <w:color w:val="1B1B1B"/>
-          <w:sz w:val="19"/>
-          <w:szCs w:val="19"/>
-        </w:rPr>
         <w:br/>
         <w:t xml:space="preserve">    Create empty augmented activity    alpha</w:t>
-      </w:r>
-      <w:r>
-        <w:rPr>
-          <w:rFonts w:ascii="Consolas" w:cs="Consolas" w:eastAsia="Consolas" w:hAnsi="Consolas"/>
-          <w:color w:val="1B1B1B"/>
-          <w:sz w:val="19"/>
-          <w:szCs w:val="19"/>
-        </w:rPr>
         <w:br/>
         <w:t xml:space="preserve">    Wait For Activity    alpha</w:t>
-      </w:r>
-      <w:r>
-        <w:rPr>
-          <w:rFonts w:ascii="Consolas" w:cs="Consolas" w:eastAsia="Consolas" w:hAnsi="Consolas"/>
-          <w:color w:val="1B1B1B"/>
-          <w:sz w:val="19"/>
-          <w:szCs w:val="19"/>
-        </w:rPr>
         <w:br/>
         <w:t xml:space="preserve">    Create empty augmented activity    omega</w:t>
-      </w:r>
-      <w:r>
-        <w:rPr>
-          <w:rFonts w:ascii="Consolas" w:cs="Consolas" w:eastAsia="Consolas" w:hAnsi="Consolas"/>
-          <w:color w:val="1B1B1B"/>
-          <w:sz w:val="19"/>
-          <w:szCs w:val="19"/>
-        </w:rPr>
         <w:br/>
         <w:t xml:space="preserve">    Wait For Activity    omega</w:t>
-      </w:r>
-      <w:r>
-        <w:rPr>
-          <w:rFonts w:ascii="Consolas" w:cs="Consolas" w:eastAsia="Consolas" w:hAnsi="Consolas"/>
-          <w:color w:val="1B1B1B"/>
-          <w:sz w:val="19"/>
-          <w:szCs w:val="19"/>
-        </w:rPr>
         <w:br/>
         <w:t xml:space="preserve"/>
-      </w:r>
-      <w:r>
-        <w:rPr>
-          <w:rFonts w:ascii="Consolas" w:cs="Consolas" w:eastAsia="Consolas" w:hAnsi="Consolas"/>
-          <w:color w:val="1B1B1B"/>
-          <w:sz w:val="19"/>
-          <w:szCs w:val="19"/>
-        </w:rPr>
         <w:br/>
         <w:t xml:space="preserve">Default sort is A-Z</w:t>
-      </w:r>
-      <w:r>
-        <w:rPr>
-          <w:rFonts w:ascii="Consolas" w:cs="Consolas" w:eastAsia="Consolas" w:hAnsi="Consolas"/>
-          <w:color w:val="1B1B1B"/>
-          <w:sz w:val="19"/>
-          <w:szCs w:val="19"/>
-        </w:rPr>
         <w:br/>
         <w:t xml:space="preserve">    Activity Should Appear Before    alpha    omega</w:t>
-      </w:r>
-      <w:r>
-        <w:rPr>
-          <w:rFonts w:ascii="Consolas" w:cs="Consolas" w:eastAsia="Consolas" w:hAnsi="Consolas"/>
-          <w:color w:val="1B1B1B"/>
-          <w:sz w:val="19"/>
-          <w:szCs w:val="19"/>
-        </w:rPr>
         <w:br/>
         <w:t xml:space="preserve"/>
-      </w:r>
-      <w:r>
-        <w:rPr>
-          <w:rFonts w:ascii="Consolas" w:cs="Consolas" w:eastAsia="Consolas" w:hAnsi="Consolas"/>
-          <w:color w:val="1B1B1B"/>
-          <w:sz w:val="19"/>
-          <w:szCs w:val="19"/>
-        </w:rPr>
         <w:br/>
         <w:t xml:space="preserve">Switching to Sort Z-A reverses the order</w:t>
-      </w:r>
-      <w:r>
-        <w:rPr>
-          <w:rFonts w:ascii="Consolas" w:cs="Consolas" w:eastAsia="Consolas" w:hAnsi="Consolas"/>
-          <w:color w:val="1B1B1B"/>
-          <w:sz w:val="19"/>
-          <w:szCs w:val="19"/>
-        </w:rPr>
         <w:br/>
         <w:t xml:space="preserve">    Set Sort Order    za</w:t>
-      </w:r>
-      <w:r>
-        <w:rPr>
-          <w:rFonts w:ascii="Consolas" w:cs="Consolas" w:eastAsia="Consolas" w:hAnsi="Consolas"/>
-          <w:color w:val="1B1B1B"/>
-          <w:sz w:val="19"/>
-          <w:szCs w:val="19"/>
-        </w:rPr>
         <w:br/>
         <w:t xml:space="preserve">    Activity Should Appear Before    omega    alpha</w:t>
-      </w:r>
-      <w:r>
-        <w:rPr>
-          <w:rFonts w:ascii="Consolas" w:cs="Consolas" w:eastAsia="Consolas" w:hAnsi="Consolas"/>
-          <w:color w:val="1B1B1B"/>
-          <w:sz w:val="19"/>
-          <w:szCs w:val="19"/>
-        </w:rPr>
         <w:br/>
         <w:t xml:space="preserve"/>
-      </w:r>
-      <w:r>
-        <w:rPr>
-          <w:rFonts w:ascii="Consolas" w:cs="Consolas" w:eastAsia="Consolas" w:hAnsi="Consolas"/>
-          <w:color w:val="1B1B1B"/>
-          <w:sz w:val="19"/>
-          <w:szCs w:val="19"/>
-        </w:rPr>
         <w:br/>
         <w:t xml:space="preserve">Switching back to Sort A-Z restores the original order</w:t>
-      </w:r>
-      <w:r>
-        <w:rPr>
-          <w:rFonts w:ascii="Consolas" w:cs="Consolas" w:eastAsia="Consolas" w:hAnsi="Consolas"/>
-          <w:color w:val="1B1B1B"/>
-          <w:sz w:val="19"/>
-          <w:szCs w:val="19"/>
-        </w:rPr>
         <w:br/>
         <w:t xml:space="preserve">    Set Sort Order    az</w:t>
-      </w:r>
-      <w:r>
-        <w:rPr>
-          <w:rFonts w:ascii="Consolas" w:cs="Consolas" w:eastAsia="Consolas" w:hAnsi="Consolas"/>
-          <w:color w:val="1B1B1B"/>
-          <w:sz w:val="19"/>
-          <w:szCs w:val="19"/>
-        </w:rPr>
         <w:br/>
         <w:t xml:space="preserve">    Activity Should Appear Before    alpha    omega</w:t>
-      </w:r>
-      <w:r>
-        <w:rPr>
-          <w:rFonts w:ascii="Consolas" w:cs="Consolas" w:eastAsia="Consolas" w:hAnsi="Consolas"/>
-          <w:color w:val="1B1B1B"/>
-          <w:sz w:val="19"/>
-          <w:szCs w:val="19"/>
-        </w:rPr>
         <w:br/>
         <w:t xml:space="preserve">    Close Browser</w:t>
       </w:r>
@@ -4941,14 +4181,6 @@
           <w:szCs w:val="19"/>
         </w:rPr>
         <w:t xml:space="preserve">py -m robot --dryrun 053_sort_activities.robot</w:t>
-      </w:r>
-      <w:r>
-        <w:rPr>
-          <w:rFonts w:ascii="Consolas" w:cs="Consolas" w:eastAsia="Consolas" w:hAnsi="Consolas"/>
-          <w:color w:val="1B1B1B"/>
-          <w:sz w:val="19"/>
-          <w:szCs w:val="19"/>
-        </w:rPr>
         <w:br/>
         <w:t xml:space="preserve">py -m robot --outputdir results_053 053_sort_activities.robot</w:t>
       </w:r>
@@ -7227,6 +6459,92 @@
           </w:p>
         </w:tc>
       </w:tr>
+      <w:tr>
+        <w:tc>
+          <w:tcPr>
+            <w:tcW w:type="dxa" w:w="2600"/>
+            <w:shd w:fill="F7F7F7" w:val="clear"/>
+            <w:tcMar>
+              <w:top w:type="dxa" w:w="80"/>
+              <w:left w:type="dxa" w:w="100"/>
+              <w:bottom w:type="dxa" w:w="80"/>
+              <w:right w:type="dxa" w:w="100"/>
+            </w:tcMar>
+            <w:vAlign w:val="center"/>
+          </w:tcPr>
+          <w:p>
+            <w:pPr>
+              <w:jc w:val="left"/>
+            </w:pPr>
+            <w:r>
+              <w:rPr>
+                <w:b w:val="false"/>
+                <w:bCs w:val="false"/>
+                <w:color w:val="222222"/>
+                <w:sz w:val="18"/>
+                <w:szCs w:val="18"/>
+              </w:rPr>
+              <w:t xml:space="preserve">Augmentation Should Contain Text</w:t>
+            </w:r>
+          </w:p>
+        </w:tc>
+        <w:tc>
+          <w:tcPr>
+            <w:tcW w:type="dxa" w:w="2600"/>
+            <w:shd w:fill="F7F7F7" w:val="clear"/>
+            <w:tcMar>
+              <w:top w:type="dxa" w:w="80"/>
+              <w:left w:type="dxa" w:w="100"/>
+              <w:bottom w:type="dxa" w:w="80"/>
+              <w:right w:type="dxa" w:w="100"/>
+            </w:tcMar>
+            <w:vAlign w:val="center"/>
+          </w:tcPr>
+          <w:p>
+            <w:pPr>
+              <w:jc w:val="left"/>
+            </w:pPr>
+            <w:r>
+              <w:rPr>
+                <w:b w:val="false"/>
+                <w:bCs w:val="false"/>
+                <w:color w:val="222222"/>
+                <w:sz w:val="18"/>
+                <w:szCs w:val="18"/>
+              </w:rPr>
+              <w:t xml:space="preserve">expected_text</w:t>
+            </w:r>
+          </w:p>
+        </w:tc>
+        <w:tc>
+          <w:tcPr>
+            <w:tcW w:type="dxa" w:w="4160"/>
+            <w:shd w:fill="F7F7F7" w:val="clear"/>
+            <w:tcMar>
+              <w:top w:type="dxa" w:w="80"/>
+              <w:left w:type="dxa" w:w="100"/>
+              <w:bottom w:type="dxa" w:w="80"/>
+              <w:right w:type="dxa" w:w="100"/>
+            </w:tcMar>
+            <w:vAlign w:val="center"/>
+          </w:tcPr>
+          <w:p>
+            <w:pPr>
+              <w:jc w:val="left"/>
+            </w:pPr>
+            <w:r>
+              <w:rPr>
+                <w:b w:val="false"/>
+                <w:bCs w:val="false"/>
+                <w:color w:val="222222"/>
+                <w:sz w:val="18"/>
+                <w:szCs w:val="18"/>
+              </w:rPr>
+              <w:t xml:space="preserve">Asserts a given text is rendered in the augmentation canvas by DOM presence, without reopening the text tool — clicking it again adds a new overlay instead of reselecting the existing one (Section 8).</w:t>
+            </w:r>
+          </w:p>
+        </w:tc>
+      </w:tr>
     </w:tbl>
     <w:p>
       <w:pPr>
@@ -8822,6 +8140,89 @@
         <w:tc>
           <w:tcPr>
             <w:tcW w:type="dxa" w:w="2600"/>
+            <w:tcMar>
+              <w:top w:type="dxa" w:w="80"/>
+              <w:left w:type="dxa" w:w="100"/>
+              <w:bottom w:type="dxa" w:w="80"/>
+              <w:right w:type="dxa" w:w="100"/>
+            </w:tcMar>
+            <w:vAlign w:val="center"/>
+          </w:tcPr>
+          <w:p>
+            <w:pPr>
+              <w:jc w:val="left"/>
+            </w:pPr>
+            <w:r>
+              <w:rPr>
+                <w:b w:val="false"/>
+                <w:bCs w:val="false"/>
+                <w:color w:val="222222"/>
+                <w:sz w:val="18"/>
+                <w:szCs w:val="18"/>
+              </w:rPr>
+              <w:t xml:space="preserve">Get Share Code From Sync Modal</w:t>
+            </w:r>
+          </w:p>
+        </w:tc>
+        <w:tc>
+          <w:tcPr>
+            <w:tcW w:type="dxa" w:w="2600"/>
+            <w:tcMar>
+              <w:top w:type="dxa" w:w="80"/>
+              <w:left w:type="dxa" w:w="100"/>
+              <w:bottom w:type="dxa" w:w="80"/>
+              <w:right w:type="dxa" w:w="100"/>
+            </w:tcMar>
+            <w:vAlign w:val="center"/>
+          </w:tcPr>
+          <w:p>
+            <w:pPr>
+              <w:jc w:val="left"/>
+            </w:pPr>
+            <w:r>
+              <w:rPr>
+                <w:b w:val="false"/>
+                <w:bCs w:val="false"/>
+                <w:color w:val="222222"/>
+                <w:sz w:val="18"/>
+                <w:szCs w:val="18"/>
+              </w:rPr>
+              <w:t xml:space="preserve">[generate_button_locator]</w:t>
+            </w:r>
+          </w:p>
+        </w:tc>
+        <w:tc>
+          <w:tcPr>
+            <w:tcW w:type="dxa" w:w="4160"/>
+            <w:tcMar>
+              <w:top w:type="dxa" w:w="80"/>
+              <w:left w:type="dxa" w:w="100"/>
+              <w:bottom w:type="dxa" w:w="80"/>
+              <w:right w:type="dxa" w:w="100"/>
+            </w:tcMar>
+            <w:vAlign w:val="center"/>
+          </w:tcPr>
+          <w:p>
+            <w:pPr>
+              <w:jc w:val="left"/>
+            </w:pPr>
+            <w:r>
+              <w:rPr>
+                <w:b w:val="false"/>
+                <w:bCs w:val="false"/>
+                <w:color w:val="222222"/>
+                <w:sz w:val="18"/>
+                <w:szCs w:val="18"/>
+              </w:rPr>
+              <w:t xml:space="preserve">Shared tail of all three Generate *Share Code keywords: click the given "generate" button, confirm the irreversible-action warning dialog, and return the resulting code.</w:t>
+            </w:r>
+          </w:p>
+        </w:tc>
+      </w:tr>
+      <w:tr>
+        <w:tc>
+          <w:tcPr>
+            <w:tcW w:type="dxa" w:w="2600"/>
             <w:shd w:fill="F7F7F7" w:val="clear"/>
             <w:tcMar>
               <w:top w:type="dxa" w:w="80"/>
@@ -13342,7 +12743,7 @@
                 <w:sz w:val="18"/>
                 <w:szCs w:val="18"/>
               </w:rPr>
-              <w:t xml:space="preserve">No</w:t>
+              <w:t xml:space="preserve">Yes (056)</w:t>
             </w:r>
           </w:p>
         </w:tc>
@@ -13798,7 +13199,7 @@
                 <w:sz w:val="18"/>
                 <w:szCs w:val="18"/>
               </w:rPr>
-              <w:t xml:space="preserve">No</w:t>
+              <w:t xml:space="preserve">Yes (055)</w:t>
             </w:r>
           </w:p>
         </w:tc>
@@ -15185,7 +14586,7 @@
                 <w:sz w:val="18"/>
                 <w:szCs w:val="18"/>
               </w:rPr>
-              <w:t xml:space="preserve">No</w:t>
+              <w:t xml:space="preserve">Yes (054)</w:t>
             </w:r>
           </w:p>
         </w:tc>
@@ -15272,6 +14673,304 @@
                 <w:szCs w:val="18"/>
               </w:rPr>
               <w:t xml:space="preserve">No</w:t>
+            </w:r>
+          </w:p>
+        </w:tc>
+      </w:tr>
+    </w:tbl>
+    <w:p>
+      <w:pPr>
+        <w:pStyle w:val="Heading2"/>
+        <w:spacing w:after="180" w:before="360"/>
+      </w:pPr>
+      <w:r>
+        <w:t xml:space="preserve">7.9 Content Persistence Across the Online/Offline Transition</w:t>
+      </w:r>
+    </w:p>
+    <w:p>
+      <w:pPr>
+        <w:spacing w:after="160" w:line="276"/>
+      </w:pPr>
+      <w:r>
+        <w:rPr>
+          <w:color w:val="222222"/>
+          <w:sz w:val="22"/>
+          <w:szCs w:val="22"/>
+        </w:rPr>
+        <w:t xml:space="preserve">Distinct from the cross-account sharing group above: these probe what happens to a single account’s own content as connectivity itself changes mid-session, rather than propagation between two accounts.</w:t>
+      </w:r>
+    </w:p>
+    <w:tbl>
+      <w:tblPr>
+        <w:tblW w:type="dxa" w:w="9360"/>
+        <w:tblBorders>
+          <w:top w:val="single" w:color="auto" w:sz="4"/>
+          <w:left w:val="single" w:color="auto" w:sz="4"/>
+          <w:bottom w:val="single" w:color="auto" w:sz="4"/>
+          <w:right w:val="single" w:color="auto" w:sz="4"/>
+          <w:insideH w:val="single" w:color="auto" w:sz="4"/>
+          <w:insideV w:val="single" w:color="auto" w:sz="4"/>
+        </w:tblBorders>
+      </w:tblPr>
+      <w:tblGrid>
+        <w:gridCol w:w="2750"/>
+        <w:gridCol w:w="5310"/>
+        <w:gridCol w:w="1300"/>
+      </w:tblGrid>
+      <w:tr>
+        <w:trPr>
+          <w:tblHeader/>
+        </w:trPr>
+        <w:tc>
+          <w:tcPr>
+            <w:tcW w:type="dxa" w:w="2750"/>
+            <w:shd w:fill="1F5C99" w:val="clear"/>
+            <w:tcMar>
+              <w:top w:type="dxa" w:w="80"/>
+              <w:left w:type="dxa" w:w="100"/>
+              <w:bottom w:type="dxa" w:w="80"/>
+              <w:right w:type="dxa" w:w="100"/>
+            </w:tcMar>
+            <w:vAlign w:val="center"/>
+          </w:tcPr>
+          <w:p>
+            <w:pPr>
+              <w:jc w:val="left"/>
+            </w:pPr>
+            <w:r>
+              <w:rPr>
+                <w:b/>
+                <w:bCs/>
+                <w:color w:val="FFFFFF"/>
+                <w:sz w:val="19"/>
+                <w:szCs w:val="19"/>
+              </w:rPr>
+              <w:t xml:space="preserve">File</w:t>
+            </w:r>
+          </w:p>
+        </w:tc>
+        <w:tc>
+          <w:tcPr>
+            <w:tcW w:type="dxa" w:w="5310"/>
+            <w:shd w:fill="1F5C99" w:val="clear"/>
+            <w:tcMar>
+              <w:top w:type="dxa" w:w="80"/>
+              <w:left w:type="dxa" w:w="100"/>
+              <w:bottom w:type="dxa" w:w="80"/>
+              <w:right w:type="dxa" w:w="100"/>
+            </w:tcMar>
+            <w:vAlign w:val="center"/>
+          </w:tcPr>
+          <w:p>
+            <w:pPr>
+              <w:jc w:val="left"/>
+            </w:pPr>
+            <w:r>
+              <w:rPr>
+                <w:b/>
+                <w:bCs/>
+                <w:color w:val="FFFFFF"/>
+                <w:sz w:val="19"/>
+                <w:szCs w:val="19"/>
+              </w:rPr>
+              <w:t xml:space="preserve">What it validates</w:t>
+            </w:r>
+          </w:p>
+        </w:tc>
+        <w:tc>
+          <w:tcPr>
+            <w:tcW w:type="dxa" w:w="1300"/>
+            <w:shd w:fill="1F5C99" w:val="clear"/>
+            <w:tcMar>
+              <w:top w:type="dxa" w:w="80"/>
+              <w:left w:type="dxa" w:w="100"/>
+              <w:bottom w:type="dxa" w:w="80"/>
+              <w:right w:type="dxa" w:w="100"/>
+            </w:tcMar>
+            <w:vAlign w:val="center"/>
+          </w:tcPr>
+          <w:p>
+            <w:pPr>
+              <w:jc w:val="left"/>
+            </w:pPr>
+            <w:r>
+              <w:rPr>
+                <w:b/>
+                <w:bCs/>
+                <w:color w:val="FFFFFF"/>
+                <w:sz w:val="19"/>
+                <w:szCs w:val="19"/>
+              </w:rPr>
+              <w:t xml:space="preserve">Offline?</w:t>
+            </w:r>
+          </w:p>
+        </w:tc>
+      </w:tr>
+      <w:tr>
+        <w:tc>
+          <w:tcPr>
+            <w:tcW w:type="dxa" w:w="2750"/>
+            <w:tcMar>
+              <w:top w:type="dxa" w:w="80"/>
+              <w:left w:type="dxa" w:w="100"/>
+              <w:bottom w:type="dxa" w:w="80"/>
+              <w:right w:type="dxa" w:w="100"/>
+            </w:tcMar>
+            <w:vAlign w:val="center"/>
+          </w:tcPr>
+          <w:p>
+            <w:pPr>
+              <w:jc w:val="left"/>
+            </w:pPr>
+            <w:r>
+              <w:rPr>
+                <w:b w:val="false"/>
+                <w:bCs w:val="false"/>
+                <w:color w:val="222222"/>
+                <w:sz w:val="18"/>
+                <w:szCs w:val="18"/>
+              </w:rPr>
+              <w:t xml:space="preserve">057_create_activity_offline_while_connected</w:t>
+            </w:r>
+          </w:p>
+        </w:tc>
+        <w:tc>
+          <w:tcPr>
+            <w:tcW w:type="dxa" w:w="5310"/>
+            <w:tcMar>
+              <w:top w:type="dxa" w:w="80"/>
+              <w:left w:type="dxa" w:w="100"/>
+              <w:bottom w:type="dxa" w:w="80"/>
+              <w:right w:type="dxa" w:w="100"/>
+            </w:tcMar>
+            <w:vAlign w:val="center"/>
+          </w:tcPr>
+          <w:p>
+            <w:pPr>
+              <w:jc w:val="left"/>
+            </w:pPr>
+            <w:r>
+              <w:rPr>
+                <w:b w:val="false"/>
+                <w:bCs w:val="false"/>
+                <w:color w:val="222222"/>
+                <w:sz w:val="18"/>
+                <w:szCs w:val="18"/>
+              </w:rPr>
+              <w:t xml:space="preserve">Creates an activity entirely offline while signed into a fresh account, then signs back in from a brand new browser session and confirms the app auto-synced it once connectivity returned — no explicit sync action taken.</w:t>
+            </w:r>
+          </w:p>
+        </w:tc>
+        <w:tc>
+          <w:tcPr>
+            <w:tcW w:type="dxa" w:w="1300"/>
+            <w:tcMar>
+              <w:top w:type="dxa" w:w="80"/>
+              <w:left w:type="dxa" w:w="100"/>
+              <w:bottom w:type="dxa" w:w="80"/>
+              <w:right w:type="dxa" w:w="100"/>
+            </w:tcMar>
+            <w:vAlign w:val="center"/>
+          </w:tcPr>
+          <w:p>
+            <w:pPr>
+              <w:jc w:val="left"/>
+            </w:pPr>
+            <w:r>
+              <w:rPr>
+                <w:b w:val="false"/>
+                <w:bCs w:val="false"/>
+                <w:color w:val="222222"/>
+                <w:sz w:val="18"/>
+                <w:szCs w:val="18"/>
+              </w:rPr>
+              <w:t xml:space="preserve">N/A</w:t>
+            </w:r>
+          </w:p>
+        </w:tc>
+      </w:tr>
+      <w:tr>
+        <w:tc>
+          <w:tcPr>
+            <w:tcW w:type="dxa" w:w="2750"/>
+            <w:shd w:fill="F7F7F7" w:val="clear"/>
+            <w:tcMar>
+              <w:top w:type="dxa" w:w="80"/>
+              <w:left w:type="dxa" w:w="100"/>
+              <w:bottom w:type="dxa" w:w="80"/>
+              <w:right w:type="dxa" w:w="100"/>
+            </w:tcMar>
+            <w:vAlign w:val="center"/>
+          </w:tcPr>
+          <w:p>
+            <w:pPr>
+              <w:jc w:val="left"/>
+            </w:pPr>
+            <w:r>
+              <w:rPr>
+                <w:b w:val="false"/>
+                <w:bCs w:val="false"/>
+                <w:color w:val="222222"/>
+                <w:sz w:val="18"/>
+                <w:szCs w:val="18"/>
+              </w:rPr>
+              <w:t xml:space="preserve">058_offline_text_edit_after_online_creation</w:t>
+            </w:r>
+          </w:p>
+        </w:tc>
+        <w:tc>
+          <w:tcPr>
+            <w:tcW w:type="dxa" w:w="5310"/>
+            <w:shd w:fill="F7F7F7" w:val="clear"/>
+            <w:tcMar>
+              <w:top w:type="dxa" w:w="80"/>
+              <w:left w:type="dxa" w:w="100"/>
+              <w:bottom w:type="dxa" w:w="80"/>
+              <w:right w:type="dxa" w:w="100"/>
+            </w:tcMar>
+            <w:vAlign w:val="center"/>
+          </w:tcPr>
+          <w:p>
+            <w:pPr>
+              <w:jc w:val="left"/>
+            </w:pPr>
+            <w:r>
+              <w:rPr>
+                <w:b w:val="false"/>
+                <w:bCs w:val="false"/>
+                <w:color w:val="222222"/>
+                <w:sz w:val="18"/>
+                <w:szCs w:val="18"/>
+              </w:rPr>
+              <w:t xml:space="preserve">Creates an activity with a text overlay online, reopens it (a page reload, so this step must stay online — see Section 8), then goes offline and confirms the same text overlay is still rendered and directly editable from local state.</w:t>
+            </w:r>
+          </w:p>
+        </w:tc>
+        <w:tc>
+          <w:tcPr>
+            <w:tcW w:type="dxa" w:w="1300"/>
+            <w:shd w:fill="F7F7F7" w:val="clear"/>
+            <w:tcMar>
+              <w:top w:type="dxa" w:w="80"/>
+              <w:left w:type="dxa" w:w="100"/>
+              <w:bottom w:type="dxa" w:w="80"/>
+              <w:right w:type="dxa" w:w="100"/>
+            </w:tcMar>
+            <w:vAlign w:val="center"/>
+          </w:tcPr>
+          <w:p>
+            <w:pPr>
+              <w:jc w:val="left"/>
+            </w:pPr>
+            <w:r>
+              <w:rPr>
+                <w:b w:val="false"/>
+                <w:bCs w:val="false"/>
+                <w:color w:val="222222"/>
+                <w:sz w:val="18"/>
+                <w:szCs w:val="18"/>
+              </w:rPr>
+              <w:t xml:space="preserve">N/A</w:t>
             </w:r>
           </w:p>
         </w:tc>
@@ -16008,6 +15707,120 @@
                 <w:szCs w:val="18"/>
               </w:rPr>
               <w:t xml:space="preserve">Slow 3G is a genuinely aggressive throttle (2000ms latency, ~62.5 KB/s). UI panels that open client-side can still take a while to render under it; the Sign In / Sign Up panel-opening waits were deliberately widened to 30s for this reason.</w:t>
+            </w:r>
+          </w:p>
+        </w:tc>
+      </w:tr>
+      <w:tr>
+        <w:tc>
+          <w:tcPr>
+            <w:tcW w:type="dxa" w:w="3000"/>
+            <w:shd w:fill="F7F7F7" w:val="clear"/>
+            <w:tcMar>
+              <w:top w:type="dxa" w:w="80"/>
+              <w:left w:type="dxa" w:w="100"/>
+              <w:bottom w:type="dxa" w:w="80"/>
+              <w:right w:type="dxa" w:w="100"/>
+            </w:tcMar>
+            <w:vAlign w:val="center"/>
+          </w:tcPr>
+          <w:p>
+            <w:pPr>
+              <w:jc w:val="left"/>
+            </w:pPr>
+            <w:r>
+              <w:rPr>
+                <w:b w:val="false"/>
+                <w:bCs w:val="false"/>
+                <w:color w:val="222222"/>
+                <w:sz w:val="18"/>
+                <w:szCs w:val="18"/>
+              </w:rPr>
+              <w:t xml:space="preserve">Reload Page (or a keyword that calls it, e.g. Find And Open Activity Menu And Edit) hits Chrome’s own “No internet” page (ERR_INTERNET_DISCONNECTED) instead of the app</w:t>
+            </w:r>
+          </w:p>
+        </w:tc>
+        <w:tc>
+          <w:tcPr>
+            <w:tcW w:type="dxa" w:w="6360"/>
+            <w:shd w:fill="F7F7F7" w:val="clear"/>
+            <w:tcMar>
+              <w:top w:type="dxa" w:w="80"/>
+              <w:left w:type="dxa" w:w="100"/>
+              <w:bottom w:type="dxa" w:w="80"/>
+              <w:right w:type="dxa" w:w="100"/>
+            </w:tcMar>
+            <w:vAlign w:val="center"/>
+          </w:tcPr>
+          <w:p>
+            <w:pPr>
+              <w:jc w:val="left"/>
+            </w:pPr>
+            <w:r>
+              <w:rPr>
+                <w:b w:val="false"/>
+                <w:bCs w:val="false"/>
+                <w:color w:val="222222"/>
+                <w:sz w:val="18"/>
+                <w:szCs w:val="18"/>
+              </w:rPr>
+              <w:t xml:space="preserve">Reloading needs connectivity even in this PWA — a hard reload was not confirmed to reliably come from the service worker cache while offline. Go Offline must come after any reload-based keyword finishes, never before it. Confirmed live: 058_offline_text_edit_after_online_creation.robot originally called Go Offline before Reopen Activity Editor and hit this exact error.</w:t>
+            </w:r>
+          </w:p>
+        </w:tc>
+      </w:tr>
+      <w:tr>
+        <w:tc>
+          <w:tcPr>
+            <w:tcW w:type="dxa" w:w="3000"/>
+            <w:tcMar>
+              <w:top w:type="dxa" w:w="80"/>
+              <w:left w:type="dxa" w:w="100"/>
+              <w:bottom w:type="dxa" w:w="80"/>
+              <w:right w:type="dxa" w:w="100"/>
+            </w:tcMar>
+            <w:vAlign w:val="center"/>
+          </w:tcPr>
+          <w:p>
+            <w:pPr>
+              <w:jc w:val="left"/>
+            </w:pPr>
+            <w:r>
+              <w:rPr>
+                <w:b w:val="false"/>
+                <w:bCs w:val="false"/>
+                <w:color w:val="222222"/>
+                <w:sz w:val="18"/>
+                <w:szCs w:val="18"/>
+              </w:rPr>
+              <w:t xml:space="preserve">Clicking a content tool button (e.g. “Text”) does nothing useful, or silently leaves a duplicate behind instead of reopening the existing overlay</w:t>
+            </w:r>
+          </w:p>
+        </w:tc>
+        <w:tc>
+          <w:tcPr>
+            <w:tcW w:type="dxa" w:w="6360"/>
+            <w:tcMar>
+              <w:top w:type="dxa" w:w="80"/>
+              <w:left w:type="dxa" w:w="100"/>
+              <w:bottom w:type="dxa" w:w="80"/>
+              <w:right w:type="dxa" w:w="100"/>
+            </w:tcMar>
+            <w:vAlign w:val="center"/>
+          </w:tcPr>
+          <w:p>
+            <w:pPr>
+              <w:jc w:val="left"/>
+            </w:pPr>
+            <w:r>
+              <w:rPr>
+                <w:b w:val="false"/>
+                <w:bCs w:val="false"/>
+                <w:color w:val="222222"/>
+                <w:sz w:val="18"/>
+                <w:szCs w:val="18"/>
+              </w:rPr>
+              <w:t xml:space="preserve">Toolbar buttons in the augmentation canvas add a new element — they do not reselect an existing one. Confirmed live via a failed run’s screenshot showing two overlapping "Edit your text..." textareas after a second click. To edit an existing overlay, click the rendered element itself (its "auras__html-container" node) instead of the toolbar. See Augmentation Should Contain Text and 058_offline_text_edit_after_online_creation.robot.</w:t>
             </w:r>
           </w:p>
         </w:tc>

</xml_diff>